<commit_message>
Shorten applicant's update notice to six clauses
Co-Authored-By: Claude Fable 5.1 <noreply@anthropic.com>
Claude-Session: https://claude.ai/code/session_012hZPyAteoBDpSfE3ectEwq
</commit_message>
<xml_diff>
--- a/protection-order-extension/הודעת_עדכון_המבקשת_הט_59722-08-26.docx
+++ b/protection-order-extension/הודעת_עדכון_המבקשת_הט_59722-08-26.docx
@@ -441,7 +441,7 @@
           <w:szCs w:val="24"/>
           <w:rtl/>
         </w:rPr>
-        <w:t xml:space="preserve">בית המשפט הנכבד מתבקש ליתן, בדחיפות ובטרם פקיעת הצו, את המבוקש בבקשה להארכת תוקף צו ההגנה ההדדי שהוגשה מטעם המבקשת (להלן: </w:t>
+        <w:t xml:space="preserve">בית המשפט הנכבד מתבקש ליתן, בדחיפות ובטרם פקיעת הצו ביום 15.09.2026, את המבוקש בבקשה להארכת תוקף צו ההגנה ההדדי (להלן: </w:t>
       </w:r>
       <w:r>
         <w:rPr>
@@ -461,7 +461,7 @@
           <w:szCs w:val="24"/>
           <w:rtl/>
         </w:rPr>
-        <w:t xml:space="preserve">), וזאת בהסכמת המשיב, אשר נמסרה בכתב, כמפורט להלן:</w:t>
+        <w:t xml:space="preserve">), וזאת בהסכמת המשיב, כמפורט להלן:</w:t>
       </w:r>
     </w:p>
     <w:p>
@@ -482,7 +482,7 @@
           <w:szCs w:val="24"/>
           <w:rtl/>
         </w:rPr>
-        <w:t xml:space="preserve">בין הצדדים עומד בתוקפו צו הגנה הדדי, אשר הוארך בהסכמת הצדדים, במסגרת ההליך הקודם שהתנהל ביניהם (ה"ט 9910-03-26), עד ליום 15.09.2026.</w:t>
+        <w:t xml:space="preserve">הבקשה הומצאה ביום 20.08.2026 לעו"ד ______________, אשר ייצגה את המשיב בהליך הקודם בין הצדדים (ה"ט 9910-03-26) ומסרה בשמו את ההסכמה להארכה הקודמת של הצו עד ליום 15.09.2026.</w:t>
       </w:r>
     </w:p>
     <w:p>
@@ -503,7 +503,7 @@
           <w:szCs w:val="24"/>
           <w:rtl/>
         </w:rPr>
-        <w:t xml:space="preserve">בבקשה עתרה המבקשת להארכת תוקף הצו בשלושה חודשים נוספים, באותה מתכונת שבה עמד בתוקפו עד כה.</w:t>
+        <w:t xml:space="preserve">משהבקשה נפתחה בתיק חדש שבו עו"ד ______________ אינה רשומה כמייצגת, לא היה באפשרותה להגיש את תגובת המשיב באמצעות מערכת נט המשפט. זו הסיבה היחידה להיעדר תגובה כתובה בתיק.</w:t>
       </w:r>
     </w:p>
     <w:p>
@@ -524,7 +524,26 @@
           <w:szCs w:val="24"/>
           <w:rtl/>
         </w:rPr>
-        <w:t xml:space="preserve">הבקשה הומצאה ביום 20.08.2026 לעו"ד ______________, אשר ייצגה את המשיב בהליך הקודם ואשר במסגרתו מסרה בשמו את הסכמתו להארכה הקודמת של הצו.</w:t>
+        <w:t xml:space="preserve">ביום ______________ מסרה עו"ד ______________ לח"מ, בכתב, את הסכמת המשיב לבקשה, בזו הלשון:</w:t>
+      </w:r>
+    </w:p>
+    <w:p>
+      <w:pPr>
+        <w:bidi/>
+        <w:spacing w:after="200" w:before="60" w:line="300" w:lineRule="auto"/>
+        <w:ind w:left="850" w:right="850"/>
+        <w:jc w:val="both"/>
+      </w:pPr>
+      <w:r>
+        <w:rPr>
+          <w:rFonts w:ascii="David" w:cs="David" w:eastAsia="David" w:hAnsi="David"/>
+          <w:i/>
+          <w:iCs/>
+          <w:sz w:val="24"/>
+          <w:szCs w:val="24"/>
+          <w:rtl/>
+        </w:rPr>
+        <w:t xml:space="preserve">"בהסתמך על הסכמה קודמת על פיה הוארך תוקפו של צו הגנה הדדי עד ליום 15.09.26, אין התנגדות של הבטמו אייסו להאריכו בשלושה חודשים נוספים, באותה מתכונת קודמת ותוך המשך קיום הסדרי ראייה עם שלושת הקטינים במרכז קשר "פלא" בטירת הכרמל".</w:t>
       </w:r>
     </w:p>
     <w:p>
@@ -545,7 +564,27 @@
           <w:szCs w:val="24"/>
           <w:rtl/>
         </w:rPr>
-        <w:t xml:space="preserve">עו"ד ______________ עדכנה את הח"מ כי ייפוי הכוח שבידיה ניתן לה לצורך ההליך הקודם בלבד, וכי משהבקשה נפתחה בתיק חדש שבו אינה רשומה כמייצגת, לא היה באפשרותה להגיש את תגובת המשיב באמצעות מערכת נט המשפט. זו, ורק זו, הסיבה שבגינה לא הוגשה תגובה כתובה בתיק, אף שהבקשה הגיעה לידי המשיב זה מכבר.</w:t>
+        <w:t xml:space="preserve">העתק ההודעה מצורף ומסומן </w:t>
+      </w:r>
+      <w:r>
+        <w:rPr>
+          <w:rFonts w:ascii="David" w:cs="David" w:eastAsia="David" w:hAnsi="David"/>
+          <w:b/>
+          <w:bCs/>
+          <w:sz w:val="24"/>
+          <w:szCs w:val="24"/>
+          <w:rtl/>
+        </w:rPr>
+        <w:t xml:space="preserve">נספח א'</w:t>
+      </w:r>
+      <w:r>
+        <w:rPr>
+          <w:rFonts w:ascii="David" w:cs="David" w:eastAsia="David" w:hAnsi="David"/>
+          <w:sz w:val="24"/>
+          <w:szCs w:val="24"/>
+          <w:rtl/>
+        </w:rPr>
+        <w:t xml:space="preserve">. אין אפוא מחלוקת בין הצדדים, והבקשה בשלה למתן החלטה.</w:t>
       </w:r>
     </w:p>
     <w:p>
@@ -566,151 +605,7 @@
           <w:szCs w:val="24"/>
           <w:rtl/>
         </w:rPr>
-        <w:t xml:space="preserve">ביום ______________ מסרה עו"ד ______________ לח"מ, בכתב, את הסכמת המשיב לבקשה, בזו הלשון:</w:t>
-      </w:r>
-    </w:p>
-    <w:p>
-      <w:pPr>
-        <w:bidi/>
-        <w:spacing w:after="200" w:before="60" w:line="300" w:lineRule="auto"/>
-        <w:ind w:left="850" w:right="850"/>
-        <w:jc w:val="both"/>
-      </w:pPr>
-      <w:r>
-        <w:rPr>
-          <w:rFonts w:ascii="David" w:cs="David" w:eastAsia="David" w:hAnsi="David"/>
-          <w:i/>
-          <w:iCs/>
-          <w:sz w:val="24"/>
-          <w:szCs w:val="24"/>
-          <w:rtl/>
-        </w:rPr>
-        <w:t xml:space="preserve">"בהסתמך על הסכמה קודמת על פיה הוארך תוקפו של צו הגנה הדדי עד ליום 15.09.26, אין התנגדות של הבטמו אייסו להאריכו בשלושה חודשים נוספים, באותה מתכונת קודמת ותוך המשך קיום הסדרי ראייה עם שלושת הקטינים במרכז קשר "פלא" בטירת הכרמל".</w:t>
-      </w:r>
-    </w:p>
-    <w:p>
-      <w:pPr>
-        <w:pStyle w:val="ListParagraph"/>
-        <w:numPr>
-          <w:ilvl w:val="0"/>
-          <w:numId w:val="2"/>
-        </w:numPr>
-        <w:bidi/>
-        <w:spacing w:after="120" w:before="0" w:line="360" w:lineRule="auto"/>
-        <w:jc w:val="both"/>
-      </w:pPr>
-      <w:r>
-        <w:rPr>
-          <w:rFonts w:ascii="David" w:cs="David" w:eastAsia="David" w:hAnsi="David"/>
-          <w:sz w:val="24"/>
-          <w:szCs w:val="24"/>
-          <w:rtl/>
-        </w:rPr>
-        <w:t xml:space="preserve">העתק הודעת ב"כ המשיב מצורף להודעה זו ומסומן </w:t>
-      </w:r>
-      <w:r>
-        <w:rPr>
-          <w:rFonts w:ascii="David" w:cs="David" w:eastAsia="David" w:hAnsi="David"/>
-          <w:b/>
-          <w:bCs/>
-          <w:sz w:val="24"/>
-          <w:szCs w:val="24"/>
-          <w:rtl/>
-        </w:rPr>
-        <w:t xml:space="preserve">נספח א'</w:t>
-      </w:r>
-      <w:r>
-        <w:rPr>
-          <w:rFonts w:ascii="David" w:cs="David" w:eastAsia="David" w:hAnsi="David"/>
-          <w:sz w:val="24"/>
-          <w:szCs w:val="24"/>
-          <w:rtl/>
-        </w:rPr>
-        <w:t xml:space="preserve">.</w:t>
-      </w:r>
-    </w:p>
-    <w:p>
-      <w:pPr>
-        <w:pStyle w:val="ListParagraph"/>
-        <w:numPr>
-          <w:ilvl w:val="0"/>
-          <w:numId w:val="2"/>
-        </w:numPr>
-        <w:bidi/>
-        <w:spacing w:after="120" w:before="0" w:line="360" w:lineRule="auto"/>
-        <w:jc w:val="both"/>
-      </w:pPr>
-      <w:r>
-        <w:rPr>
-          <w:rFonts w:ascii="David" w:cs="David" w:eastAsia="David" w:hAnsi="David"/>
-          <w:sz w:val="24"/>
-          <w:szCs w:val="24"/>
-          <w:rtl/>
-        </w:rPr>
-        <w:t xml:space="preserve">הנה כי כן, המשיב מסכים להארכת תוקף צו ההגנה ההדדי בשלושה חודשים נוספים, באותה מתכונת, לרבות המשך קיום הסדרי הראייה עם שלושת הקטינים במרכז הקשר "פלא" בטירת הכרמל, כפי שהתקיימו עד כה. אין אפוא כל מחלוקת בין הצדדים, והבקשה בשלה למתן החלטה.</w:t>
-      </w:r>
-    </w:p>
-    <w:p>
-      <w:pPr>
-        <w:pStyle w:val="ListParagraph"/>
-        <w:numPr>
-          <w:ilvl w:val="0"/>
-          <w:numId w:val="2"/>
-        </w:numPr>
-        <w:bidi/>
-        <w:spacing w:after="120" w:before="0" w:line="360" w:lineRule="auto"/>
-        <w:jc w:val="both"/>
-      </w:pPr>
-      <w:r>
-        <w:rPr>
-          <w:rFonts w:ascii="David" w:cs="David" w:eastAsia="David" w:hAnsi="David"/>
-          <w:sz w:val="24"/>
-          <w:szCs w:val="24"/>
-          <w:rtl/>
-        </w:rPr>
-        <w:t xml:space="preserve">תוקף הצו הקיים פוקע ביום 15.09.2026. מתן ההחלטה בטרם מועד זה נדרש כדי למנוע פער בין פקיעת הצו הקיים לבין תחילת תוקפה של ההארכה, על כל המשתמע מכך לעניין ההגנה על המבקשת ועל הקטינים.</w:t>
-      </w:r>
-    </w:p>
-    <w:p>
-      <w:pPr>
-        <w:pStyle w:val="ListParagraph"/>
-        <w:numPr>
-          <w:ilvl w:val="0"/>
-          <w:numId w:val="2"/>
-        </w:numPr>
-        <w:bidi/>
-        <w:spacing w:after="120" w:before="0" w:line="360" w:lineRule="auto"/>
-        <w:jc w:val="both"/>
-      </w:pPr>
-      <w:r>
-        <w:rPr>
-          <w:rFonts w:ascii="David" w:cs="David" w:eastAsia="David" w:hAnsi="David"/>
-          <w:sz w:val="24"/>
-          <w:szCs w:val="24"/>
-          <w:rtl/>
-        </w:rPr>
-        <w:t xml:space="preserve">אשר על כן, מתבקש בית המשפט הנכבד ליתן את המבוקש בבקשה ולהורות, בהסכמת הצדדים, על הארכת תוקף צו ההגנה ההדדי בשלושה חודשים נוספים, מיום 15.09.2026 ועד ליום 15.12.2026, באותה מתכונת שבה עמד בתוקפו עד כה, ותוך המשך קיום הסדרי הראייה עם הקטינים במרכז הקשר "פלא" בטירת הכרמל.</w:t>
-      </w:r>
-    </w:p>
-    <w:p>
-      <w:pPr>
-        <w:pStyle w:val="ListParagraph"/>
-        <w:numPr>
-          <w:ilvl w:val="0"/>
-          <w:numId w:val="2"/>
-        </w:numPr>
-        <w:bidi/>
-        <w:spacing w:after="120" w:before="0" w:line="360" w:lineRule="auto"/>
-        <w:jc w:val="both"/>
-      </w:pPr>
-      <w:r>
-        <w:rPr>
-          <w:rFonts w:ascii="David" w:cs="David" w:eastAsia="David" w:hAnsi="David"/>
-          <w:sz w:val="24"/>
-          <w:szCs w:val="24"/>
-          <w:rtl/>
-        </w:rPr>
-        <w:t xml:space="preserve">למען הסדר הטוב, ומאחר שהמשיב אינו מיוצג בהליך זה, מתבקש בית המשפט הנכבד להורות על המצאת ההחלטה למשיב עצמו, לפי כתובתו הרשומה בתיק.</w:t>
+        <w:t xml:space="preserve">אשר על כן, מתבקש בית המשפט הנכבד להורות, בהסכמת הצדדים, על הארכת תוקף צו ההגנה ההדדי בשלושה חודשים נוספים, מיום 15.09.2026 ועד ליום 15.12.2026, באותה מתכונת שבה עמד בתוקפו עד כה, תוך המשך קיום הסדרי הראייה עם הקטינים במרכז הקשר "פלא" בטירת הכרמל; וכן להורות על המצאת ההחלטה למשיב עצמו, שאינו מיוצג בהליך זה.</w:t>
       </w:r>
     </w:p>
     <w:p>

</xml_diff>